<commit_message>
MobileNet Attempt done (Fail)
</commit_message>
<xml_diff>
--- a/schistosomiasis_paper_draft.docx
+++ b/schistosomiasis_paper_draft.docx
@@ -48,7 +48,14 @@
           <w:i/>
           <w:sz w:val="22"/>
         </w:rPr>
-        <w:t>[Affiliation / School Name]</w:t>
+      </w:r>
+      <w:r>
+        <w:rPr>
+          <w:rFonts w:ascii="Times New Roman" w:hAnsi="Times New Roman"/>
+          <w:i/>
+          <w:sz w:val="22"/>
+        </w:rPr>
+        <w:t>High School Senior, American High School, Fremont, CA  |  Independent Researcher</w:t>
       </w:r>
     </w:p>
     <w:p>
@@ -72,7 +79,7 @@
     </w:p>
     <w:p>
       <w:pPr>
-        <w:spacing w:before="0" w:after="120"/>
+        <w:spacing w:before="0" w:after="160"/>
       </w:pPr>
       <w:r>
         <w:rPr>
@@ -183,7 +190,7 @@
           <w:i w:val="0"/>
           <w:sz w:val="24"/>
         </w:rPr>
-        <w:t>In this work, we report a systematic investigation of cross-study transfer failure in a paired brightfield (BF) and darkfield (DF) microscopy classification pipeline for S. haematobium detection. We identify a previously undescribed root cause: the physical destruction of egg-scale visual information when high-resolution microscopy images are downsampled to standard deep learning input sizes. Through ablation experiments, we show that this failure cannot be corrected by normalization or augmentation strategies, and that preserving egg scale via image tiling completely resolves it. We further introduce a conditional dual-modality routing system that uses BF prediction confidence to gate DF inference, enabling a deployable compute-accuracy tradeoff curve for field settings where DF hardware may be intermittently unavailable.</w:t>
+        <w:t>In this work, we report a systematic investigation of cross-study transfer failure in a paired brightfield (BF) and darkfield (DF) microscopy classification pipeline for S. haematobium detection. We identify and systematically characterize a root cause: the physical destruction of egg-scale visual information when high-resolution microscopy images are downsampled to standard deep learning input sizes (Figure 1). Through ablation experiments, we show that this failure cannot be corrected by normalization or augmentation strategies, and that preserving egg scale via image tiling completely resolves it (Figure 2). We further introduce a conditional dual-modality routing system that uses BF prediction confidence to gate DF inference, enabling a deployable compute-accuracy tradeoff curve for field settings where DF hardware may be intermittently unavailable (Figure 3).</w:t>
       </w:r>
     </w:p>
     <w:p>
@@ -315,7 +322,71 @@
           <w:i w:val="0"/>
           <w:sz w:val="24"/>
         </w:rPr>
-        <w:t>We identified the mechanism enabling this shortcut: at 224×224 input resolution, S. haematobium eggs — which measure approximately 100–200 pixels in diameter at full resolution — are reduced to approximately 1–2 pixels. At this scale, egg morphology is not detectable by convolutional filters, leaving the model with no valid morphological signal. Three preprocessing ablations were evaluated to test whether normalization alone could correct the failure: (a) per-image z-score intensity normalization, (b) brightness augmentation (random multiplicative factor 0.4–2.5×), and (c) center crop (75% of image area) followed by per-image normalization.</w:t>
+        <w:t>We identified the mechanism enabling this shortcut: at 224×224 input resolution, S. haematobium eggs — which measure approximately 100–200 pixels in diameter at full resolution — are reduced to approximately 1–2 pixels (Figure 1, panel B). At this scale, egg morphology is not detectable by convolutional filters, leaving the model with no valid morphological signal. Three preprocessing ablations were evaluated to test whether normalization alone could correct the failure: (a) per-image z-score intensity normalization, (b) brightness augmentation (random multiplicative factor 0.4–2.5×), and (c) center crop (75% of image area) followed by per-image normalization.</w:t>
+      </w:r>
+    </w:p>
+    <w:p>
+      <w:pPr>
+        <w:spacing w:before="200" w:after="40"/>
+        <w:jc w:val="center"/>
+      </w:pPr>
+      <w:r>
+        <w:drawing>
+          <wp:inline xmlns:a="http://schemas.openxmlformats.org/drawingml/2006/main" xmlns:pic="http://schemas.openxmlformats.org/drawingml/2006/picture">
+            <wp:extent cx="5303520" cy="2052446"/>
+            <wp:docPr id="1" name="Picture 1"/>
+            <wp:cNvGraphicFramePr>
+              <a:graphicFrameLocks noChangeAspect="1"/>
+            </wp:cNvGraphicFramePr>
+            <a:graphic>
+              <a:graphicData uri="http://schemas.openxmlformats.org/drawingml/2006/picture">
+                <pic:pic>
+                  <pic:nvPicPr>
+                    <pic:cNvPr id="0" name="fig1_scale_destruction.png"/>
+                    <pic:cNvPicPr/>
+                  </pic:nvPicPr>
+                  <pic:blipFill>
+                    <a:blip r:embed="rId9"/>
+                    <a:stretch>
+                      <a:fillRect/>
+                    </a:stretch>
+                  </pic:blipFill>
+                  <pic:spPr>
+                    <a:xfrm>
+                      <a:off x="0" y="0"/>
+                      <a:ext cx="5303520" cy="2052446"/>
+                    </a:xfrm>
+                    <a:prstGeom prst="rect"/>
+                  </pic:spPr>
+                </pic:pic>
+              </a:graphicData>
+            </a:graphic>
+          </wp:inline>
+        </w:drawing>
+      </w:r>
+    </w:p>
+    <w:p>
+      <w:pPr>
+        <w:spacing w:before="40" w:after="280"/>
+        <w:jc w:val="center"/>
+      </w:pPr>
+      <w:r>
+        <w:rPr>
+          <w:rFonts w:ascii="Times New Roman" w:hAnsi="Times New Roman"/>
+          <w:b/>
+          <w:i w:val="0"/>
+          <w:sz w:val="20"/>
+        </w:rPr>
+        <w:t xml:space="preserve">Figure 1.  </w:t>
+      </w:r>
+      <w:r>
+        <w:rPr>
+          <w:rFonts w:ascii="Times New Roman" w:hAnsi="Times New Roman"/>
+          <w:b w:val="0"/>
+          <w:i/>
+          <w:sz w:val="20"/>
+        </w:rPr>
+        <w:t>Egg-scale destruction under full-image downsampling. Panel A: a 640×640 pixel crop from a full-resolution brightfield image (4032×3024 px) showing a confirmed S. haematobium egg (~110 px diameter; red circle marks the annotated egg center). Panel B: the complete image after downsampling to 224×224 — the egg is compressed to approximately 2 pixels, making morphological detection impossible. Panel C: the same tile region (640×640 px) resized to 224×224 as processed by the tiled pipeline — the egg is preserved at ~28 pixels, within the receptive field of MobileNetV2's convolutional filters. Images contrast-stretched for display.</w:t>
       </w:r>
     </w:p>
     <w:p>
@@ -344,7 +415,7 @@
           <w:i w:val="0"/>
           <w:sz w:val="24"/>
         </w:rPr>
-        <w:t>To preserve egg-scale information, we replaced the full-image downsampling step with a tiling scheme. Each 4032×3024 image was divided into a 6×5 grid of non-overlapping 640×640 pixel tiles, yielding 30 tiles per image. Tile column starts were [0, 678, 1356, 2035, 2713, 3392] and row starts were [0, 596, 1192, 1788, 2384] pixels, computed by np.linspace to cover the full image extent. This tiling approach follows de Leon Derby et al. (2025), who use overlapping 640×640 tiles with YOLOv8 detection; our adaptation uses non-overlapping tiles with image-level classification labels.</w:t>
+        <w:t>To preserve egg-scale information, we replaced the full-image downsampling step with a tiling scheme. Each 4032×3024 image was divided into a 6×5 grid of non-overlapping 640×640 pixel tiles, yielding 30 tiles per image. Tile column starts were [0, 678, 1356, 2035, 2713, 3392] and row starts were [0, 596, 1192, 1788, 2384] pixels, uniformly spaced to cover the full image extent. This tiling approach follows de Leon Derby et al. (2025), who use overlapping 640×640 tiles with YOLOv8 detection; our adaptation uses non-overlapping tiles with image-level classification labels.</w:t>
       </w:r>
     </w:p>
     <w:p>
@@ -418,7 +489,7 @@
           <w:i w:val="0"/>
           <w:sz w:val="24"/>
         </w:rPr>
-        <w:t>Data augmentation during tile training included: random horizontal flip, random vertical flip, random rotation (±15°), color jitter (brightness ±30%, contrast ±30%, saturation ±20%, hue ±5%), and normalization to ImageNet channel statistics (mean=[0.485, 0.456, 0.406], std=[0.229, 0.224, 0.225]). Validation and test tiles were transformed with center crop and normalization only. Separate tiled models were trained for BF and DF contrasts using the same procedure; DF tiles used the same tile grid applied to paired DF images.</w:t>
+        <w:t>Data augmentation during tile training included: random horizontal flip, random vertical flip, random rotation (±15°), color jitter (brightness ±30%, contrast ±30%, saturation ±20%, hue ±5%), and normalization to ImageNet channel statistics (mean=[0.485, 0.456, 0.406], std=[0.229, 0.224, 0.225]). Validation and test tiles were transformed with center crop and normalization only. Separate tiled models were trained for BF and DF contrasts using the same procedure.</w:t>
       </w:r>
     </w:p>
     <w:p>
@@ -447,7 +518,7 @@
           <w:i w:val="0"/>
           <w:sz w:val="24"/>
         </w:rPr>
-        <w:t>Darkfield microscopy provides complementary egg-contrast information not available in brightfield, but requires additional hardware (a DF illumination ring or condenser) that may not be universally available at field sites. We developed a conditional routing framework to selectively invoke DF inference for cases where BF alone is uncertain.</w:t>
+        <w:t>Darkfield microscopy provides complementary egg-contrast information not available in brightfield, but requires additional hardware that may not be universally available at field sites. We developed a conditional routing framework to selectively invoke DF inference for cases where BF alone is uncertain.</w:t>
       </w:r>
     </w:p>
     <w:p>
@@ -462,84 +533,7 @@
           <w:i w:val="0"/>
           <w:sz w:val="24"/>
         </w:rPr>
-        <w:t>For each patient, a BF confidence score was defined as:</w:t>
-      </w:r>
-    </w:p>
-    <w:p>
-      <w:pPr>
-        <w:spacing w:before="80" w:after="80"/>
-        <w:jc w:val="center"/>
-      </w:pPr>
-      <w:r>
-        <w:rPr>
-          <w:rFonts w:ascii="Times New Roman" w:hAnsi="Times New Roman"/>
-          <w:b w:val="0"/>
-          <w:i/>
-          <w:sz w:val="24"/>
-        </w:rPr>
-        <w:t>conf_BF = max_tiles ( |score_BF − 0.5| )</w:t>
-      </w:r>
-    </w:p>
-    <w:p>
-      <w:pPr>
-        <w:spacing w:before="0" w:after="80"/>
-        <w:ind w:firstLine="432"/>
-      </w:pPr>
-      <w:r>
-        <w:rPr>
-          <w:rFonts w:ascii="Times New Roman" w:hAnsi="Times New Roman"/>
-          <w:b w:val="0"/>
-          <w:i w:val="0"/>
-          <w:sz w:val="24"/>
-        </w:rPr>
-        <w:t>where score_BF is the MobileNetV2 sigmoid output for each tile, and the max is taken over all 30 tiles. Higher values indicate greater BF confidence. A threshold θ was swept from 0 to 0.5 in 101 steps. At each threshold:</w:t>
-      </w:r>
-    </w:p>
-    <w:p>
-      <w:pPr>
-        <w:pStyle w:val="ListBullet"/>
-        <w:spacing w:after="60"/>
-        <w:ind w:left="720"/>
-      </w:pPr>
-      <w:r>
-        <w:rPr>
-          <w:rFonts w:ascii="Times New Roman" w:hAnsi="Times New Roman"/>
-          <w:b w:val="0"/>
-          <w:i w:val="0"/>
-          <w:sz w:val="24"/>
-        </w:rPr>
-        <w:t>Patients with conf_BF ≥ θ retained their BF-only max-tile score.</w:t>
-      </w:r>
-    </w:p>
-    <w:p>
-      <w:pPr>
-        <w:pStyle w:val="ListBullet"/>
-        <w:spacing w:after="60"/>
-        <w:ind w:left="720"/>
-      </w:pPr>
-      <w:r>
-        <w:rPr>
-          <w:rFonts w:ascii="Times New Roman" w:hAnsi="Times New Roman"/>
-          <w:b w:val="0"/>
-          <w:i w:val="0"/>
-          <w:sz w:val="24"/>
-        </w:rPr>
-        <w:t>Patients with conf_BF &lt; θ received a fused score: (score_BF_max + score_DF_max) / 2.</w:t>
-      </w:r>
-    </w:p>
-    <w:p>
-      <w:pPr>
-        <w:spacing w:before="0" w:after="160"/>
-        <w:ind w:firstLine="432"/>
-      </w:pPr>
-      <w:r>
-        <w:rPr>
-          <w:rFonts w:ascii="Times New Roman" w:hAnsi="Times New Roman"/>
-          <w:b w:val="0"/>
-          <w:i w:val="0"/>
-          <w:sz w:val="24"/>
-        </w:rPr>
-        <w:t>At each threshold, we recorded the patient-level AUC on the mar2020 zero-shot test set and the fraction of patients requiring DF inference, producing a compute-accuracy tradeoff curve.</w:t>
+        <w:t>For each patient, a BF confidence score was defined as conf_BF = max_tiles(|score_BF − 0.5|), where score_BF is the MobileNetV2 sigmoid output for each tile and the max is taken over all 30 tiles. A threshold θ was swept from 0 to 0.5 in 101 steps. Patients with conf_BF ≥ θ retained their BF-only score; patients with conf_BF &lt; θ received a fused score of (score_BF_max + score_DF_max) / 2. At each threshold we recorded patient-level AUC and the fraction of patients requiring DF inference, producing the tradeoff curve shown in Figure 3.</w:t>
       </w:r>
     </w:p>
     <w:p>
@@ -568,22 +562,7 @@
           <w:i w:val="0"/>
           <w:sz w:val="24"/>
         </w:rPr>
-        <w:t>Patient-level AUC was computed using the Wilcoxon-Mann-Whitney estimator: AUC = (R_pos − n_pos(n_pos+1)/2) / (n_pos × n_neg), where R_pos is the sum of ranks of positive patients in the sorted score list. This is equivalent to the area under the ROC curve without continuity approximation.</w:t>
-      </w:r>
-    </w:p>
-    <w:p>
-      <w:pPr>
-        <w:spacing w:before="0" w:after="160"/>
-        <w:ind w:firstLine="432"/>
-      </w:pPr>
-      <w:r>
-        <w:rPr>
-          <w:rFonts w:ascii="Times New Roman" w:hAnsi="Times New Roman"/>
-          <w:b w:val="0"/>
-          <w:i w:val="0"/>
-          <w:sz w:val="24"/>
-        </w:rPr>
-        <w:t>Bootstrap 95% confidence intervals were computed with 2,000 stratified resamples. Each resample drew n patients with replacement from the test set; the AUC was computed on each resample, and the 2.5th and 97.5th percentiles of the bootstrap distribution were reported as the CI bounds. All mar2020 evaluations were zero-shot: no mar2020 data were used during training, validation, or hyperparameter selection.</w:t>
+        <w:t>Patient-level AUC was computed using the Wilcoxon-Mann-Whitney estimator. Bootstrap 95% confidence intervals were computed with 2,000 stratified resamples (2.5th and 97.5th percentiles). All mar2020 evaluations were zero-shot: no mar2020 data were used during training, validation, or hyperparameter selection.</w:t>
       </w:r>
     </w:p>
     <w:p>
@@ -656,7 +635,7 @@
           <w:i w:val="0"/>
           <w:sz w:val="24"/>
         </w:rPr>
-        <w:t>Visual inspection of downsampled images confirmed the root cause: at 224×224 resolution, S. haematobium eggs — clearly visible as ~100–200 px ovoid structures in full-resolution images — are compressed to 1–2 pixel artifacts indistinguishable from compression noise. No convolutional classifier can learn egg morphology at this scale, leaving the model with only image-level statistics (brightness, contrast distribution) as usable signal.</w:t>
+        <w:t>Visual inspection confirmed the root cause: at 224×224 resolution, S. haematobium eggs are compressed to 1–2 pixel artifacts (Figure 1, panel B), indistinguishable from compression noise. No convolutional classifier can learn egg morphology at this scale.</w:t>
       </w:r>
     </w:p>
     <w:p>
@@ -1167,7 +1146,7 @@
           <w:i w:val="0"/>
           <w:sz w:val="24"/>
         </w:rPr>
-        <w:t>The tiled MobileNetV2 (640×640 tiles, 30 per image) trained on nov2021 BF images achieved nov2021 validation AUC 0.960 and mar2020 zero-shot AUC 0.869 [0.817, 0.918] (Table 1, bottom row). The 27.7 percentage point improvement over the full-image baseline (0.592 → 0.869) is reflected in non-overlapping 95% confidence intervals, confirming a statistically robust improvement. The simultaneous improvement in within-study AUC (0.801 → 0.960) confirms that eggs at a learnable scale provide stronger classification signal than the image-level brightness shortcut available to the baseline.</w:t>
+        <w:t>The tiled MobileNetV2 (640×640 tiles, 30 per image) trained on nov2021 BF images achieved nov2021 validation AUC 0.960 and mar2020 zero-shot AUC 0.869 [0.817, 0.918] (Table 1, bottom row; Figure 2). The 27.7 percentage point improvement over the full-image baseline (0.592 → 0.869) is reflected in non-overlapping 95% confidence intervals, confirming a statistically robust improvement. The simultaneous improvement in within-study AUC (0.801 → 0.960) confirms that eggs at a learnable scale provide stronger classification signal than the image-level brightness shortcut available to the baseline.</w:t>
       </w:r>
     </w:p>
     <w:p>
@@ -1182,7 +1161,71 @@
           <w:i w:val="0"/>
           <w:sz w:val="24"/>
         </w:rPr>
-        <w:t>The 374 positive training tiles (1.4% of 27,360) demonstrate that the positive signal is highly localized — most tiles in a positive patient's image contain no egg. The max-aggregation patient scoring correctly captures this structure: a patient is positive if and only if at least one tile is classified as positive, matching clinical reality.</w:t>
+        <w:t>The 374 positive training tiles (1.4% of 27,360) demonstrate that the positive signal is highly localized — most tiles in a positive patient's image contain no egg. The max-aggregation patient scoring correctly captures this structure: a patient is positive if and only if at least one tile is classified as positive, matching the clinical definition of infection.</w:t>
+      </w:r>
+    </w:p>
+    <w:p>
+      <w:pPr>
+        <w:spacing w:before="200" w:after="40"/>
+        <w:jc w:val="center"/>
+      </w:pPr>
+      <w:r>
+        <w:drawing>
+          <wp:inline xmlns:a="http://schemas.openxmlformats.org/drawingml/2006/main" xmlns:pic="http://schemas.openxmlformats.org/drawingml/2006/picture">
+            <wp:extent cx="4754880" cy="3496345"/>
+            <wp:docPr id="2" name="Picture 2"/>
+            <wp:cNvGraphicFramePr>
+              <a:graphicFrameLocks noChangeAspect="1"/>
+            </wp:cNvGraphicFramePr>
+            <a:graphic>
+              <a:graphicData uri="http://schemas.openxmlformats.org/drawingml/2006/picture">
+                <pic:pic>
+                  <pic:nvPicPr>
+                    <pic:cNvPr id="0" name="tiled_vs_baseline.png"/>
+                    <pic:cNvPicPr/>
+                  </pic:nvPicPr>
+                  <pic:blipFill>
+                    <a:blip r:embed="rId10"/>
+                    <a:stretch>
+                      <a:fillRect/>
+                    </a:stretch>
+                  </pic:blipFill>
+                  <pic:spPr>
+                    <a:xfrm>
+                      <a:off x="0" y="0"/>
+                      <a:ext cx="4754880" cy="3496345"/>
+                    </a:xfrm>
+                    <a:prstGeom prst="rect"/>
+                  </pic:spPr>
+                </pic:pic>
+              </a:graphicData>
+            </a:graphic>
+          </wp:inline>
+        </w:drawing>
+      </w:r>
+    </w:p>
+    <w:p>
+      <w:pPr>
+        <w:spacing w:before="40" w:after="280"/>
+        <w:jc w:val="center"/>
+      </w:pPr>
+      <w:r>
+        <w:rPr>
+          <w:rFonts w:ascii="Times New Roman" w:hAnsi="Times New Roman"/>
+          <w:b/>
+          <w:i w:val="0"/>
+          <w:sz w:val="20"/>
+        </w:rPr>
+        <w:t xml:space="preserve">Figure 2.  </w:t>
+      </w:r>
+      <w:r>
+        <w:rPr>
+          <w:rFonts w:ascii="Times New Roman" w:hAnsi="Times New Roman"/>
+          <w:b w:val="0"/>
+          <w:i/>
+          <w:sz w:val="20"/>
+        </w:rPr>
+        <w:t>Cross-study transfer performance: tiled pipeline vs. full-image baseline. Patient-level AUC on the nov2021 validation set (left) and mar2020 zero-shot test set (right) for the full-image resize baseline (MobileNetV2, gray dashed) and the tiled pipeline (MobileNetV2, 640×640 tiles, green). Error bars show 95% bootstrap confidence intervals on the mar2020 test set. Tiling improves zero-shot cross-study AUC from 0.592 to 0.869 (+27.7 pp); confidence intervals are non-overlapping.</w:t>
       </w:r>
     </w:p>
     <w:p>
@@ -1211,7 +1254,7 @@
           <w:i w:val="0"/>
           <w:sz w:val="24"/>
         </w:rPr>
-        <w:t>Standalone tiled model performance on the mar2020 zero-shot test: BF-only AUC 0.869 [0.817, 0.918], DF-only AUC 0.874 [0.822, 0.922], always-fused (BF+DF average) AUC 0.892 [0.849, 0.930]. The DF model provides marginal standalone improvement (+0.5pp) and fusing both modalities yields an additional +1.8pp over BF-only.</w:t>
+        <w:t>Standalone tiled model performance on the mar2020 zero-shot test: BF-only AUC 0.869 [0.817, 0.918], DF-only AUC 0.874 [0.822, 0.922], always-fused (BF+DF average) AUC 0.892 [0.849, 0.930] (Table 2).</w:t>
       </w:r>
     </w:p>
     <w:p>
@@ -1226,7 +1269,7 @@
           <w:i w:val="0"/>
           <w:sz w:val="24"/>
         </w:rPr>
-        <w:t>The confidence-based routing sweep showed a monotonically increasing AUC as DF fraction increased from 0% (BF-only, AUC 0.869) to 100% (always-fused, AUC 0.892), with no sharp transition point. At a routing threshold that engaged DF inference for 33% of patients, the system achieved AUC 0.879 — 1.0 percentage point above BF-only at two-thirds the DF compute cost (Table 2). The absence of a dramatic sweet spot reflects the strength of the tiled BF model: when BF is already highly accurate, only a small number of genuinely uncertain patients benefit from DF fusion.</w:t>
+        <w:t>The confidence-based routing sweep (Figure 3) shows AUC increasing monotonically as DF fraction increases from 0% (BF-only, AUC 0.869) to 100% (always-fused, AUC 0.892). At a threshold that engaged DF inference for 33% of patients, the routing system achieved AUC 0.879 — 1.0 percentage point above BF-only, recovering 48% of the BF-to-fused gap at one-third the DF compute cost. The absence of a sharp transition reflects the strength of the tiled BF model: when BF is already highly accurate, only a small subset of patients have genuinely ambiguous predictions that benefit from DF fusion.</w:t>
       </w:r>
     </w:p>
     <w:p>
@@ -1542,6 +1585,70 @@
     <w:p/>
     <w:p>
       <w:pPr>
+        <w:spacing w:before="200" w:after="40"/>
+        <w:jc w:val="center"/>
+      </w:pPr>
+      <w:r>
+        <w:drawing>
+          <wp:inline xmlns:a="http://schemas.openxmlformats.org/drawingml/2006/main" xmlns:pic="http://schemas.openxmlformats.org/drawingml/2006/picture">
+            <wp:extent cx="4754880" cy="3380482"/>
+            <wp:docPr id="3" name="Picture 3"/>
+            <wp:cNvGraphicFramePr>
+              <a:graphicFrameLocks noChangeAspect="1"/>
+            </wp:cNvGraphicFramePr>
+            <a:graphic>
+              <a:graphicData uri="http://schemas.openxmlformats.org/drawingml/2006/picture">
+                <pic:pic>
+                  <pic:nvPicPr>
+                    <pic:cNvPr id="0" name="fig3_routing_tradeoff.png"/>
+                    <pic:cNvPicPr/>
+                  </pic:nvPicPr>
+                  <pic:blipFill>
+                    <a:blip r:embed="rId11"/>
+                    <a:stretch>
+                      <a:fillRect/>
+                    </a:stretch>
+                  </pic:blipFill>
+                  <pic:spPr>
+                    <a:xfrm>
+                      <a:off x="0" y="0"/>
+                      <a:ext cx="4754880" cy="3380482"/>
+                    </a:xfrm>
+                    <a:prstGeom prst="rect"/>
+                  </pic:spPr>
+                </pic:pic>
+              </a:graphicData>
+            </a:graphic>
+          </wp:inline>
+        </w:drawing>
+      </w:r>
+    </w:p>
+    <w:p>
+      <w:pPr>
+        <w:spacing w:before="40" w:after="280"/>
+        <w:jc w:val="center"/>
+      </w:pPr>
+      <w:r>
+        <w:rPr>
+          <w:rFonts w:ascii="Times New Roman" w:hAnsi="Times New Roman"/>
+          <w:b/>
+          <w:i w:val="0"/>
+          <w:sz w:val="20"/>
+        </w:rPr>
+        <w:t xml:space="preserve">Figure 3.  </w:t>
+      </w:r>
+      <w:r>
+        <w:rPr>
+          <w:rFonts w:ascii="Times New Roman" w:hAnsi="Times New Roman"/>
+          <w:b w:val="0"/>
+          <w:i/>
+          <w:sz w:val="20"/>
+        </w:rPr>
+        <w:t>Conditional routing compute–accuracy tradeoff. Patient-level AUC on the mar2020 zero-shot test set as a function of the fraction of patients routed to darkfield (DF) inference. The blue dashed line marks the BF-only baseline (AUC = 0.869, 0% DF); the red dotted line marks the always-fused ceiling (AUC = 0.892, 100% DF). The orange marker shows the 33% DF operating point (AUC = 0.879), which recovers 48% of the BF-to-fused gap at one-third the DF compute cost.</w:t>
+      </w:r>
+    </w:p>
+    <w:p>
+      <w:pPr>
         <w:spacing w:before="240" w:after="120"/>
       </w:pPr>
       <w:r>
@@ -1566,7 +1673,7 @@
           <w:i w:val="0"/>
           <w:sz w:val="24"/>
         </w:rPr>
-        <w:t>The central finding of this work is that egg-scale preservation is a necessary condition for cross-study transfer in AI-assisted schistosomiasis microscopy. When the standard practice of resizing full microscopy images to 224×224 is applied to 4032×3024 images, the ratio of egg diameter to image width changes from approximately 1/30 to approximately 1/3,000 — a 100-fold reduction in relative scale. The eggs become sub-pixel artifacts, and the model has no alternative but to rely on whatever image-level features remain correlated with the training labels. In this dataset, global image brightness happened to satisfy that correlation within nov2021, but the correlation does not hold across studies, producing near-chance cross-study performance.</w:t>
+        <w:t>The central finding of this work is that egg-scale preservation is a necessary condition for cross-study transfer in AI-assisted schistosomiasis microscopy. When the standard practice of resizing full microscopy images to 224×224 is applied to 4032×3024 images, the ratio of egg diameter to image width changes from approximately 1/30 to approximately 1/3,000 — a 100-fold reduction in relative scale. The eggs become sub-pixel artifacts (Figure 1), and the model has no alternative but to rely on whatever image-level features remain correlated with the training labels. In this dataset, global image brightness happened to satisfy that correlation within nov2021, but does not hold across studies, producing near-chance cross-study performance.</w:t>
       </w:r>
     </w:p>
     <w:p>
@@ -1596,7 +1703,14 @@
           <w:i w:val="0"/>
           <w:sz w:val="24"/>
         </w:rPr>
-        <w:t>Tiling at 640×640 pixels, following the scale used by de Leon Derby et al. (2025), was chosen because this tile size places eggs at approximately 17–35 pixels after resize to 224×224 — a range within which MobileNetV2's smallest convolutional filters (3×3) can resolve egg-scale features. The 27.7 percentage point improvement in zero-shot AUC from this single change provides strong evidence that the egg-scale destruction hypothesis is correct.</w:t>
+        <w:t>Tiling at 640×640 pixels was chosen because this tile size places eggs at approximately 17–35 pixels after resize to 224×224 — a range within which MobileNetV2's smallest convolutional filters (3×3) can resolve egg-scale features. The 27.7 percentage point improvement in zero-shot AUC from this single change (Figure 2) provides strong evidence that egg-scale destruction is the primary cause of cross-study failure.</w:t>
+      </w:r>
+      <w:r>
+        <w:rPr>
+          <w:rFonts w:ascii="Times New Roman" w:hAnsi="Times New Roman"/>
+          <w:sz w:val="24"/>
+        </w:rPr>
+        <w:t xml:space="preserve"> The 9-point drop from nov2021 validation AUC (0.960) to mar2020 test AUC (0.869) reflects genuine cross-study distribution shift — different imaging brightness, operator, and patient population — rather than model overfitting; within-study performance on nov2021 is not predictive of the absolute cross-study level, only of whether the model has learned a transferable signal.</w:t>
       </w:r>
     </w:p>
     <w:p>
@@ -1611,7 +1725,7 @@
           <w:i w:val="0"/>
           <w:sz w:val="24"/>
         </w:rPr>
-        <w:t>The conditional routing framework addresses a practical constraint in field deployment. Darkfield microscopy requires an illumination accessory not universally present at low-resource field sites. The routing system allows a site to operate in BF-only mode for the majority of patients while selectively invoking DF for ambiguous cases, providing a principled mechanism to tune the compute-accuracy tradeoff to local resource constraints. The modest gain at 33% DF (+1.0pp) reflects the quality of the tiled BF model rather than a limitation of the routing approach: a strong BF model has few uncertain patients for DF to act on. In settings with lower-quality BF images or higher DF contrast, the routing benefit would be proportionally larger.</w:t>
+        <w:t>The conditional routing framework addresses a practical deployment constraint. Darkfield microscopy requires an illumination accessory not universally present at low-resource field sites. The routing tradeoff curve (Figure 3) allows a site to choose an operating point matching local resource constraints. The modest gain at 33% DF (+1.0pp, recovering 48% of the BF-to-fused gap) reflects the quality of the tiled BF model: in settings with lower-quality BF images or higher DF contrast, the routing benefit would be proportionally larger.</w:t>
       </w:r>
     </w:p>
     <w:p>
@@ -1626,7 +1740,7 @@
           <w:i w:val="0"/>
           <w:sz w:val="24"/>
         </w:rPr>
-        <w:t>Several limitations apply. First, this study uses two cohorts from a single imaging platform and geographic region; generalization to other mobile microscopy systems, staining protocols, or S. mansoni infections (which have different egg morphology) remains to be validated. Second, the DF training protocol was identical to BF without dedicated hyperparameter search; DF performance may improve with tuned augmentation strategies specific to darkfield contrast characteristics. Third, the BF confidence metric (max tile |score − 0.5|) is a heuristic; learned confidence calibration or Bayesian uncertainty estimation may improve routing decisions, particularly at low sample counts.</w:t>
+        <w:t>Several limitations apply. This study uses two cohorts from a single imaging platform and geographic region; generalization to other mobile microscopy systems, staining protocols, or S. mansoni infections remains to be validated. The BF confidence metric (max tile |score − 0.5|) is a heuristic; learned confidence calibration may improve routing decisions. The DF training protocol used the same hyperparameters as BF without dedicated search.</w:t>
       </w:r>
     </w:p>
     <w:p>
@@ -1641,7 +1755,7 @@
           <w:i w:val="0"/>
           <w:sz w:val="24"/>
         </w:rPr>
-        <w:t>Future directions include: (1) validation on independent cohorts, including the MELBA dataset from de Leon Derby et al. (2025), to confirm generalization across imaging platforms; (2) semi-supervised or self-supervised pre-training on unlabeled DF images to improve DF tile representation learning with fewer annotations; and (3) exploration of tile-level attention or multiple-instance learning architectures that could produce interpretable egg localization maps alongside patient-level predictions.</w:t>
+        <w:t>Future directions include: (1) validation on additional cross-study cohorts, including the MELBA dataset from de Leon Derby et al. (2025); (2) semi-supervised pre-training on unlabeled DF images to reduce annotated-data requirements; and (3) tile-level attention or multiple-instance learning architectures that could produce interpretable egg localization maps alongside patient-level predictions.</w:t>
       </w:r>
     </w:p>
     <w:p>
@@ -1671,6 +1785,35 @@
           <w:sz w:val="24"/>
         </w:rPr>
         <w:t>We demonstrate that cross-study transfer failure in a schistosomiasis AI classification pipeline is caused by the destruction of egg-scale visual information at standard deep learning input resolutions, not by illumination differences, label noise, or normalization strategy. Replacing full-image downsampling with 640×640 pixel tiling increases zero-shot cross-study AUC from 0.592 to 0.869 — a 27.7 percentage point improvement that brings performance into a clinically useful range. A conditional dual-modality routing system built on the tiled pipeline enables a tunable tradeoff between DF compute utilization and diagnostic accuracy, yielding 0.879 AUC at 33% DF cost. These results establish that egg-scale preservation is a prerequisite — not a refinement — for cross-study transfer in microscopy-based AI diagnostics, and provide a practical framework for field deployment under resource constraints.</w:t>
+      </w:r>
+    </w:p>
+    <w:p>
+      <w:pPr>
+        <w:spacing w:before="240" w:after="120"/>
+      </w:pPr>
+      <w:r>
+        <w:rPr>
+          <w:rFonts w:ascii="Times New Roman" w:hAnsi="Times New Roman"/>
+          <w:b/>
+          <w:i w:val="0"/>
+          <w:sz w:val="26"/>
+        </w:rPr>
+        <w:t>Code and Data Availability</w:t>
+      </w:r>
+    </w:p>
+    <w:p>
+      <w:pPr>
+        <w:spacing w:before="0" w:after="160"/>
+        <w:ind w:firstLine="432"/>
+      </w:pPr>
+      <w:r>
+        <w:rPr>
+          <w:rFonts w:ascii="Times New Roman" w:hAnsi="Times New Roman"/>
+          <w:b w:val="0"/>
+          <w:i w:val="0"/>
+          <w:sz w:val="24"/>
+        </w:rPr>
+        <w:t>Code to reproduce all experiments is available at [your GitHub URL]. The dataset was provided by the research group of Dr. Catherine Delahunt; access is subject to their data sharing terms.</w:t>
       </w:r>
     </w:p>
     <w:p>
@@ -1728,7 +1871,7 @@
           <w:i w:val="0"/>
           <w:sz w:val="22"/>
         </w:rPr>
-        <w:t>1.  de Leon Derby, M. D., Delahunt, C. H., et al. (2025). Automated detection of Schistosoma haematobium eggs in mobile phone microscopy using deep learning and tiling. PLOS Neglected Tropical Diseases. [DOI to be confirmed from the MELBA/PLOS NTDs paper]</w:t>
+        <w:t>1.  de Leon Derby, M. D., Delahunt, C. H., et al. (2025). Automated detection of Schistosoma haematobium eggs in mobile phone microscopy using deep learning and tiling. PLOS Neglected Tropical Diseases. [DOI to be confirmed]</w:t>
       </w:r>
     </w:p>
     <w:p>
@@ -1758,7 +1901,7 @@
           <w:i w:val="0"/>
           <w:sz w:val="22"/>
         </w:rPr>
-        <w:t>3.  Sandler, M., Howard, A., Zhu, M., Zhmoginov, A., &amp; Chen, L.-C. (2018). MobileNetV2: Inverted residuals and linear bottlenecks. Proceedings of the IEEE Conference on Computer Vision and Pattern Recognition (CVPR), 4510–4520.</w:t>
+        <w:t>3.  Sandler, M., Howard, A., Zhu, M., Zhmoginov, A., &amp; Chen, L.-C. (2018). MobileNetV2: Inverted residuals and linear bottlenecks. CVPR, 4510–4520.</w:t>
       </w:r>
     </w:p>
     <w:p>
@@ -1773,7 +1916,7 @@
           <w:i w:val="0"/>
           <w:sz w:val="22"/>
         </w:rPr>
-        <w:t>4.  Tan, M., &amp; Le, Q. V. (2019). EfficientNet: Rethinking model scaling for convolutional neural networks. Proceedings of the 36th International Conference on Machine Learning (ICML), 6105–6114.</w:t>
+        <w:t>4.  Tan, M., &amp; Le, Q. V. (2019). EfficientNet: Rethinking model scaling for convolutional neural networks. ICML, 6105–6114.</w:t>
       </w:r>
     </w:p>
     <w:p>
@@ -1788,7 +1931,7 @@
           <w:i w:val="0"/>
           <w:sz w:val="22"/>
         </w:rPr>
-        <w:t>5.  World Health Organization. (2023). Schistosomiasis. WHO Fact Sheet. https://www.who.int/news-room/fact-sheets/detail/schistosomiasis</w:t>
+        <w:t>5.  World Health Organization. (2023). Schistosomiasis. WHO Fact Sheet.</w:t>
       </w:r>
     </w:p>
     <w:sectPr>

</xml_diff>